<commit_message>
report: update reference. GHG emissions part
</commit_message>
<xml_diff>
--- a/doc/template/20260224_my-reference.docx
+++ b/doc/template/20260224_my-reference.docx
@@ -5,9 +5,6 @@
     <w:p>
       <w:pPr>
         <w:pStyle w:val="Title"/>
-        <w:rPr>
-          <w:rFonts w:hint="eastAsia"/>
-        </w:rPr>
       </w:pPr>
       <w:r>
         <w:rPr>
@@ -19,9 +16,6 @@
     <w:p>
       <w:pPr>
         <w:pStyle w:val="Subtitle"/>
-        <w:rPr>
-          <w:rFonts w:hint="eastAsia"/>
-        </w:rPr>
       </w:pPr>
       <w:r>
         <w:rPr>
@@ -33,9 +27,6 @@
     <w:p>
       <w:pPr>
         <w:pStyle w:val="Author"/>
-        <w:rPr>
-          <w:rFonts w:hint="eastAsia"/>
-        </w:rPr>
       </w:pPr>
       <w:r>
         <w:rPr>
@@ -47,9 +38,6 @@
     <w:p>
       <w:pPr>
         <w:pStyle w:val="Date"/>
-        <w:rPr>
-          <w:rFonts w:hint="eastAsia"/>
-        </w:rPr>
       </w:pPr>
       <w:r>
         <w:rPr>
@@ -61,9 +49,6 @@
     <w:p>
       <w:pPr>
         <w:pStyle w:val="Abstract"/>
-        <w:rPr>
-          <w:rFonts w:hint="eastAsia"/>
-        </w:rPr>
       </w:pPr>
       <w:r>
         <w:rPr>
@@ -75,9 +60,6 @@
     <w:p>
       <w:pPr>
         <w:pStyle w:val="Heading1"/>
-        <w:rPr>
-          <w:rFonts w:hint="eastAsia"/>
-        </w:rPr>
       </w:pPr>
       <w:bookmarkStart w:id="0" w:name="heading-1"/>
       <w:r>
@@ -91,9 +73,6 @@
     <w:p>
       <w:pPr>
         <w:pStyle w:val="Heading2"/>
-        <w:rPr>
-          <w:rFonts w:hint="eastAsia"/>
-        </w:rPr>
       </w:pPr>
       <w:bookmarkStart w:id="1" w:name="heading-2"/>
       <w:r>
@@ -107,9 +86,6 @@
     <w:p>
       <w:pPr>
         <w:pStyle w:val="Heading3"/>
-        <w:rPr>
-          <w:rFonts w:hint="eastAsia"/>
-        </w:rPr>
       </w:pPr>
       <w:bookmarkStart w:id="2" w:name="heading-3"/>
       <w:r>
@@ -123,9 +99,6 @@
     <w:p>
       <w:pPr>
         <w:pStyle w:val="Heading4"/>
-        <w:rPr>
-          <w:rFonts w:hint="eastAsia"/>
-        </w:rPr>
       </w:pPr>
       <w:bookmarkStart w:id="3" w:name="heading-4"/>
       <w:r>
@@ -139,9 +112,6 @@
     <w:p>
       <w:pPr>
         <w:pStyle w:val="Heading5"/>
-        <w:rPr>
-          <w:rFonts w:hint="eastAsia"/>
-        </w:rPr>
       </w:pPr>
       <w:bookmarkStart w:id="4" w:name="heading-5"/>
       <w:r>
@@ -155,9 +125,6 @@
     <w:p>
       <w:pPr>
         <w:pStyle w:val="Heading6"/>
-        <w:rPr>
-          <w:rFonts w:hint="eastAsia"/>
-        </w:rPr>
       </w:pPr>
       <w:bookmarkStart w:id="5" w:name="heading-6"/>
       <w:r>
@@ -171,9 +138,6 @@
     <w:p>
       <w:pPr>
         <w:pStyle w:val="Heading7"/>
-        <w:rPr>
-          <w:rFonts w:hint="eastAsia"/>
-        </w:rPr>
       </w:pPr>
       <w:bookmarkStart w:id="6" w:name="heading-7"/>
       <w:r>
@@ -187,9 +151,6 @@
     <w:p>
       <w:pPr>
         <w:pStyle w:val="Heading8"/>
-        <w:rPr>
-          <w:rFonts w:hint="eastAsia"/>
-        </w:rPr>
       </w:pPr>
       <w:bookmarkStart w:id="7" w:name="heading-8"/>
       <w:r>
@@ -203,9 +164,6 @@
     <w:p>
       <w:pPr>
         <w:pStyle w:val="Heading9"/>
-        <w:rPr>
-          <w:rFonts w:hint="eastAsia"/>
-        </w:rPr>
       </w:pPr>
       <w:bookmarkStart w:id="8" w:name="heading-9"/>
       <w:r>
@@ -219,9 +177,6 @@
     <w:p>
       <w:pPr>
         <w:pStyle w:val="FirstParagraph"/>
-        <w:rPr>
-          <w:rFonts w:hint="eastAsia"/>
-        </w:rPr>
       </w:pPr>
       <w:r>
         <w:rPr>
@@ -233,9 +188,6 @@
     <w:p>
       <w:pPr>
         <w:pStyle w:val="BodyText"/>
-        <w:rPr>
-          <w:rFonts w:hint="eastAsia"/>
-        </w:rPr>
       </w:pPr>
       <w:r>
         <w:rPr>
@@ -282,9 +234,6 @@
     <w:p>
       <w:pPr>
         <w:pStyle w:val="BlockText"/>
-        <w:rPr>
-          <w:rFonts w:hint="eastAsia"/>
-        </w:rPr>
       </w:pPr>
       <w:r>
         <w:rPr>
@@ -296,9 +245,6 @@
     <w:p>
       <w:pPr>
         <w:pStyle w:val="TableCaption"/>
-        <w:rPr>
-          <w:rFonts w:hint="eastAsia"/>
-        </w:rPr>
       </w:pPr>
       <w:r>
         <w:rPr>
@@ -315,8 +261,8 @@
         <w:tblCaption w:val="Table caption."/>
       </w:tblPr>
       <w:tblGrid>
-        <w:gridCol w:w="705"/>
-        <w:gridCol w:w="705"/>
+        <w:gridCol w:w="682"/>
+        <w:gridCol w:w="682"/>
       </w:tblGrid>
       <w:tr>
         <w:trPr>
@@ -329,9 +275,6 @@
           <w:p>
             <w:pPr>
               <w:pStyle w:val="Compact"/>
-              <w:rPr>
-                <w:rFonts w:hint="eastAsia"/>
-              </w:rPr>
             </w:pPr>
             <w:r>
               <w:rPr>
@@ -348,9 +291,6 @@
           <w:p>
             <w:pPr>
               <w:pStyle w:val="Compact"/>
-              <w:rPr>
-                <w:rFonts w:hint="eastAsia"/>
-              </w:rPr>
             </w:pPr>
             <w:r>
               <w:rPr>
@@ -369,9 +309,6 @@
           <w:p>
             <w:pPr>
               <w:pStyle w:val="Compact"/>
-              <w:rPr>
-                <w:rFonts w:hint="eastAsia"/>
-              </w:rPr>
             </w:pPr>
             <w:r>
               <w:rPr>
@@ -388,9 +325,6 @@
           <w:p>
             <w:pPr>
               <w:pStyle w:val="Compact"/>
-              <w:rPr>
-                <w:rFonts w:hint="eastAsia"/>
-              </w:rPr>
             </w:pPr>
             <w:r>
               <w:rPr>
@@ -405,9 +339,6 @@
     <w:p>
       <w:pPr>
         <w:pStyle w:val="ImageCaption"/>
-        <w:rPr>
-          <w:rFonts w:hint="eastAsia"/>
-        </w:rPr>
       </w:pPr>
       <w:r>
         <w:rPr>
@@ -419,9 +350,6 @@
     <w:p>
       <w:pPr>
         <w:pStyle w:val="DefinitionTerm"/>
-        <w:rPr>
-          <w:rFonts w:hint="eastAsia"/>
-        </w:rPr>
       </w:pPr>
       <w:proofErr w:type="spellStart"/>
       <w:r>
@@ -435,9 +363,6 @@
     <w:p>
       <w:pPr>
         <w:pStyle w:val="Definition"/>
-        <w:rPr>
-          <w:rFonts w:hint="eastAsia"/>
-        </w:rPr>
       </w:pPr>
       <w:r>
         <w:rPr>
@@ -449,9 +374,6 @@
     <w:p>
       <w:pPr>
         <w:pStyle w:val="DefinitionTerm"/>
-        <w:rPr>
-          <w:rFonts w:hint="eastAsia"/>
-        </w:rPr>
       </w:pPr>
       <w:proofErr w:type="spellStart"/>
       <w:r>
@@ -537,13 +459,7 @@
         </w:numPr>
       </w:pPr>
     </w:p>
-    <w:p>
-      <w:pPr>
-        <w:rPr>
-          <w:rFonts w:hint="eastAsia"/>
-        </w:rPr>
-      </w:pPr>
-    </w:p>
+    <w:p/>
     <w:p>
       <w:pPr>
         <w:pStyle w:val="ListBullet2"/>
@@ -1439,10 +1355,13 @@
     <w:name w:val="Body Text"/>
     <w:basedOn w:val="Normal"/>
     <w:qFormat/>
-    <w:rsid w:val="002C1974"/>
+    <w:rsid w:val="00BC458B"/>
     <w:pPr>
       <w:spacing w:before="180" w:after="180"/>
     </w:pPr>
+    <w:rPr>
+      <w:sz w:val="21"/>
+    </w:rPr>
   </w:style>
   <w:style w:type="paragraph" w:customStyle="1" w:styleId="FirstParagraph">
     <w:name w:val="First Paragraph"/>
@@ -1728,9 +1647,9 @@
     <w:uiPriority w:val="9"/>
     <w:unhideWhenUsed/>
     <w:qFormat/>
-    <w:rsid w:val="00D51086"/>
-    <w:rPr>
-      <w:sz w:val="21"/>
+    <w:rsid w:val="00BC458B"/>
+    <w:rPr>
+      <w:sz w:val="20"/>
     </w:rPr>
   </w:style>
   <w:style w:type="paragraph" w:customStyle="1" w:styleId="FootnoteBlockText">
@@ -1800,13 +1719,21 @@
   <w:style w:type="paragraph" w:customStyle="1" w:styleId="TableCaption">
     <w:name w:val="Table Caption"/>
     <w:basedOn w:val="Caption"/>
+    <w:rsid w:val="000344A4"/>
     <w:pPr>
       <w:keepNext/>
     </w:pPr>
+    <w:rPr>
+      <w:sz w:val="21"/>
+    </w:rPr>
   </w:style>
   <w:style w:type="paragraph" w:customStyle="1" w:styleId="ImageCaption">
     <w:name w:val="Image Caption"/>
     <w:basedOn w:val="Caption"/>
+    <w:rsid w:val="000344A4"/>
+    <w:rPr>
+      <w:sz w:val="21"/>
+    </w:rPr>
   </w:style>
   <w:style w:type="paragraph" w:customStyle="1" w:styleId="Figure">
     <w:name w:val="Figure"/>
@@ -1869,46 +1796,58 @@
   <w:style w:type="paragraph" w:styleId="ListBullet">
     <w:name w:val="List Bullet"/>
     <w:basedOn w:val="Normal"/>
-    <w:rsid w:val="00917E53"/>
+    <w:rsid w:val="00BC458B"/>
     <w:pPr>
       <w:numPr>
         <w:numId w:val="2"/>
       </w:numPr>
       <w:contextualSpacing/>
     </w:pPr>
+    <w:rPr>
+      <w:sz w:val="21"/>
+    </w:rPr>
   </w:style>
   <w:style w:type="paragraph" w:styleId="ListBullet2">
     <w:name w:val="List Bullet 2"/>
     <w:basedOn w:val="Normal"/>
-    <w:rsid w:val="009550EE"/>
+    <w:rsid w:val="00BC458B"/>
     <w:pPr>
       <w:numPr>
         <w:numId w:val="3"/>
       </w:numPr>
       <w:contextualSpacing/>
     </w:pPr>
+    <w:rPr>
+      <w:sz w:val="21"/>
+    </w:rPr>
   </w:style>
   <w:style w:type="paragraph" w:styleId="ListNumber">
     <w:name w:val="List Number"/>
     <w:basedOn w:val="Normal"/>
-    <w:rsid w:val="00917E53"/>
+    <w:rsid w:val="00BC458B"/>
     <w:pPr>
       <w:numPr>
         <w:numId w:val="9"/>
       </w:numPr>
       <w:contextualSpacing/>
     </w:pPr>
+    <w:rPr>
+      <w:sz w:val="21"/>
+    </w:rPr>
   </w:style>
   <w:style w:type="paragraph" w:styleId="ListNumber2">
     <w:name w:val="List Number 2"/>
     <w:basedOn w:val="Normal"/>
-    <w:rsid w:val="00917E53"/>
+    <w:rsid w:val="00BC458B"/>
     <w:pPr>
       <w:numPr>
         <w:numId w:val="10"/>
       </w:numPr>
       <w:contextualSpacing/>
     </w:pPr>
+    <w:rPr>
+      <w:sz w:val="21"/>
+    </w:rPr>
   </w:style>
 </w:styles>
 </file>

</xml_diff>